<commit_message>
vault backup: 2026-06-21 00:38:11
</commit_message>
<xml_diff>
--- a/2026-6/综述撰写/综述提纲-0413.docx
+++ b/2026-6/综述撰写/综述提纲-0413.docx
@@ -1,6 +1,6 @@
 
 <file path=word/document.xml><?xml version="1.0" encoding="utf-8"?>
-<w:document xmlns:wpc="http://schemas.microsoft.com/office/word/2010/wordprocessingCanvas" xmlns:cx="http://schemas.microsoft.com/office/drawing/2014/chartex" xmlns:cx1="http://schemas.microsoft.com/office/drawing/2015/9/8/chartex" xmlns:mc="http://schemas.openxmlformats.org/markup-compatibility/2006" xmlns:o="urn:schemas-microsoft-com:office:office" xmlns:r="http://schemas.openxmlformats.org/officeDocument/2006/relationships" xmlns:m="http://schemas.openxmlformats.org/officeDocument/2006/math" xmlns:v="urn:schemas-microsoft-com:vml" xmlns:wp14="http://schemas.microsoft.com/office/word/2010/wordprocessingDrawing" xmlns:wp="http://schemas.openxmlformats.org/drawingml/2006/wordprocessingDrawing" xmlns:w10="urn:schemas-microsoft-com:office:word" xmlns:w="http://schemas.openxmlformats.org/wordprocessingml/2006/main" xmlns:w14="http://schemas.microsoft.com/office/word/2010/wordml" xmlns:w15="http://schemas.microsoft.com/office/word/2012/wordml" xmlns:w16se="http://schemas.microsoft.com/office/word/2015/wordml/symex" xmlns:wpg="http://schemas.microsoft.com/office/word/2010/wordprocessingGroup" xmlns:wpi="http://schemas.microsoft.com/office/word/2010/wordprocessingInk" xmlns:wne="http://schemas.microsoft.com/office/word/2006/wordml" xmlns:wps="http://schemas.microsoft.com/office/word/2010/wordprocessingShape" mc:Ignorable="w14 w15 w16se wp14">
+<w:document xmlns:wpc="http://schemas.microsoft.com/office/word/2010/wordprocessingCanvas" xmlns:cx="http://schemas.microsoft.com/office/drawing/2014/chartex" xmlns:cx1="http://schemas.microsoft.com/office/drawing/2015/9/8/chartex" xmlns:cx2="http://schemas.microsoft.com/office/drawing/2015/10/21/chartex" xmlns:cx3="http://schemas.microsoft.com/office/drawing/2016/5/9/chartex" xmlns:cx4="http://schemas.microsoft.com/office/drawing/2016/5/10/chartex" xmlns:cx5="http://schemas.microsoft.com/office/drawing/2016/5/11/chartex" xmlns:cx6="http://schemas.microsoft.com/office/drawing/2016/5/12/chartex" xmlns:cx7="http://schemas.microsoft.com/office/drawing/2016/5/13/chartex" xmlns:cx8="http://schemas.microsoft.com/office/drawing/2016/5/14/chartex" xmlns:mc="http://schemas.openxmlformats.org/markup-compatibility/2006" xmlns:aink="http://schemas.microsoft.com/office/drawing/2016/ink" xmlns:am3d="http://schemas.microsoft.com/office/drawing/2017/model3d" xmlns:o="urn:schemas-microsoft-com:office:office" xmlns:oel="http://schemas.microsoft.com/office/2019/extlst" xmlns:r="http://schemas.openxmlformats.org/officeDocument/2006/relationships" xmlns:m="http://schemas.openxmlformats.org/officeDocument/2006/math" xmlns:v="urn:schemas-microsoft-com:vml" xmlns:wp14="http://schemas.microsoft.com/office/word/2010/wordprocessingDrawing" xmlns:wp="http://schemas.openxmlformats.org/drawingml/2006/wordprocessingDrawing" xmlns:w10="urn:schemas-microsoft-com:office:word" xmlns:w="http://schemas.openxmlformats.org/wordprocessingml/2006/main" xmlns:w14="http://schemas.microsoft.com/office/word/2010/wordml" xmlns:w15="http://schemas.microsoft.com/office/word/2012/wordml" xmlns:w16cex="http://schemas.microsoft.com/office/word/2018/wordml/cex" xmlns:w16cid="http://schemas.microsoft.com/office/word/2016/wordml/cid" xmlns:w16="http://schemas.microsoft.com/office/word/2018/wordml" xmlns:w16du="http://schemas.microsoft.com/office/word/2023/wordml/word16du" xmlns:w16sdtdh="http://schemas.microsoft.com/office/word/2020/wordml/sdtdatahash" xmlns:w16sdtfl="http://schemas.microsoft.com/office/word/2024/wordml/sdtformatlock" xmlns:w16se="http://schemas.microsoft.com/office/word/2015/wordml/symex" xmlns:wpg="http://schemas.microsoft.com/office/word/2010/wordprocessingGroup" xmlns:wpi="http://schemas.microsoft.com/office/word/2010/wordprocessingInk" xmlns:wne="http://schemas.microsoft.com/office/word/2006/wordml" xmlns:wps="http://schemas.microsoft.com/office/word/2010/wordprocessingShape" mc:Ignorable="w14 w15 w16se w16cid w16 w16cex w16sdtdh w16sdtfl w16du wp14">
   <w:body>
     <w:p>
       <w:pPr>
@@ -10,12 +10,21 @@
           <w:b/>
         </w:rPr>
       </w:pPr>
-      <w:r>
-        <w:rPr>
-          <w:rFonts w:ascii="Times New Roman" w:eastAsia="宋体" w:hAnsi="Times New Roman" w:cs="Times New Roman"/>
-          <w:b/>
-        </w:rPr>
-        <w:t>超材料在土木工程中的应用范式转变：从高性能建造、多功能集成到既有结构升级</w:t>
+      <w:proofErr w:type="gramStart"/>
+      <w:r>
+        <w:rPr>
+          <w:rFonts w:ascii="Times New Roman" w:eastAsia="宋体" w:hAnsi="Times New Roman" w:cs="Times New Roman"/>
+          <w:b/>
+        </w:rPr>
+        <w:t>超材料</w:t>
+      </w:r>
+      <w:proofErr w:type="gramEnd"/>
+      <w:r>
+        <w:rPr>
+          <w:rFonts w:ascii="Times New Roman" w:eastAsia="宋体" w:hAnsi="Times New Roman" w:cs="Times New Roman"/>
+          <w:b/>
+        </w:rPr>
+        <w:t>在土木工程中的应用范式转变：从高性能建造、多功能集成到既有结构升级</w:t>
       </w:r>
     </w:p>
     <w:p>
@@ -58,7 +67,21 @@
         <w:rPr>
           <w:rFonts w:ascii="Times New Roman" w:eastAsia="宋体" w:hAnsi="Times New Roman" w:cs="Times New Roman"/>
         </w:rPr>
-        <w:t>简要说明超材料的定义与</w:t>
+        <w:t>简要说明</w:t>
+      </w:r>
+      <w:proofErr w:type="gramStart"/>
+      <w:r>
+        <w:rPr>
+          <w:rFonts w:ascii="Times New Roman" w:eastAsia="宋体" w:hAnsi="Times New Roman" w:cs="Times New Roman"/>
+        </w:rPr>
+        <w:t>超材料</w:t>
+      </w:r>
+      <w:proofErr w:type="gramEnd"/>
+      <w:r>
+        <w:rPr>
+          <w:rFonts w:ascii="Times New Roman" w:eastAsia="宋体" w:hAnsi="Times New Roman" w:cs="Times New Roman"/>
+        </w:rPr>
+        <w:t>的定义与</w:t>
       </w:r>
       <w:r>
         <w:rPr>
@@ -70,7 +93,21 @@
         <w:rPr>
           <w:rFonts w:ascii="Times New Roman" w:eastAsia="宋体" w:hAnsi="Times New Roman" w:cs="Times New Roman"/>
         </w:rPr>
-        <w:t>特点，如可调力学性质、负泊松比、波控能力等。</w:t>
+        <w:t>特点，如可调力学性质、负泊松比、</w:t>
+      </w:r>
+      <w:proofErr w:type="gramStart"/>
+      <w:r>
+        <w:rPr>
+          <w:rFonts w:ascii="Times New Roman" w:eastAsia="宋体" w:hAnsi="Times New Roman" w:cs="Times New Roman"/>
+        </w:rPr>
+        <w:t>波控能力</w:t>
+      </w:r>
+      <w:proofErr w:type="gramEnd"/>
+      <w:r>
+        <w:rPr>
+          <w:rFonts w:ascii="Times New Roman" w:eastAsia="宋体" w:hAnsi="Times New Roman" w:cs="Times New Roman"/>
+        </w:rPr>
+        <w:t>等。</w:t>
       </w:r>
       <w:r>
         <w:rPr>
@@ -254,7 +291,21 @@
         <w:rPr>
           <w:rFonts w:ascii="Times New Roman" w:eastAsia="宋体" w:hAnsi="Times New Roman" w:cs="Times New Roman" w:hint="eastAsia"/>
         </w:rPr>
-        <w:t>正是超材料能够大显身手的“极端场景”。</w:t>
+        <w:t>正是</w:t>
+      </w:r>
+      <w:proofErr w:type="gramStart"/>
+      <w:r>
+        <w:rPr>
+          <w:rFonts w:ascii="Times New Roman" w:eastAsia="宋体" w:hAnsi="Times New Roman" w:cs="Times New Roman" w:hint="eastAsia"/>
+        </w:rPr>
+        <w:t>超材料</w:t>
+      </w:r>
+      <w:proofErr w:type="gramEnd"/>
+      <w:r>
+        <w:rPr>
+          <w:rFonts w:ascii="Times New Roman" w:eastAsia="宋体" w:hAnsi="Times New Roman" w:cs="Times New Roman" w:hint="eastAsia"/>
+        </w:rPr>
+        <w:t>能够大显身手的“极端场景”。</w:t>
       </w:r>
       <w:r>
         <w:rPr>
@@ -285,7 +336,21 @@
         <w:rPr>
           <w:rFonts w:ascii="Times New Roman" w:eastAsia="宋体" w:hAnsi="Times New Roman" w:cs="Times New Roman"/>
         </w:rPr>
-        <w:t>，实现了自然材料所不具备的超常力学、声学、热学等性质。本文将系统梳理超材料在土木工程领域的三大核心应用前景，旨在为未来基础设施的创新设计与可持续维护提供理论参考。</w:t>
+        <w:t>，实现了自然材料所不具备的超常力学、声学、热学等性质。本文将系统梳理</w:t>
+      </w:r>
+      <w:proofErr w:type="gramStart"/>
+      <w:r>
+        <w:rPr>
+          <w:rFonts w:ascii="Times New Roman" w:eastAsia="宋体" w:hAnsi="Times New Roman" w:cs="Times New Roman"/>
+        </w:rPr>
+        <w:t>超材料</w:t>
+      </w:r>
+      <w:proofErr w:type="gramEnd"/>
+      <w:r>
+        <w:rPr>
+          <w:rFonts w:ascii="Times New Roman" w:eastAsia="宋体" w:hAnsi="Times New Roman" w:cs="Times New Roman"/>
+        </w:rPr>
+        <w:t>在土木工程领域的三大核心应用前景，旨在为未来基础设施的创新设计与可持续维护提供理论参考。</w:t>
       </w:r>
       <w:r>
         <w:rPr>
@@ -435,7 +500,21 @@
         <w:rPr>
           <w:rFonts w:ascii="Times New Roman" w:eastAsia="宋体" w:hAnsi="Times New Roman" w:cs="Times New Roman"/>
         </w:rPr>
-        <w:t>聚焦力学超材料（</w:t>
+        <w:t>聚焦</w:t>
+      </w:r>
+      <w:proofErr w:type="gramStart"/>
+      <w:r>
+        <w:rPr>
+          <w:rFonts w:ascii="Times New Roman" w:eastAsia="宋体" w:hAnsi="Times New Roman" w:cs="Times New Roman"/>
+        </w:rPr>
+        <w:t>力学超</w:t>
+      </w:r>
+      <w:proofErr w:type="gramEnd"/>
+      <w:r>
+        <w:rPr>
+          <w:rFonts w:ascii="Times New Roman" w:eastAsia="宋体" w:hAnsi="Times New Roman" w:cs="Times New Roman"/>
+        </w:rPr>
+        <w:t>材料（</w:t>
       </w:r>
       <w:r>
         <w:rPr>
@@ -478,7 +557,21 @@
         <w:rPr>
           <w:rFonts w:ascii="Times New Roman" w:eastAsia="宋体" w:hAnsi="Times New Roman" w:cs="Times New Roman"/>
         </w:rPr>
-        <w:t>本章逻辑：按解决的具体力学痛点展开，从基材微结构直接讲到宏观构件</w:t>
+        <w:t>本章逻辑：</w:t>
+      </w:r>
+      <w:proofErr w:type="gramStart"/>
+      <w:r>
+        <w:rPr>
+          <w:rFonts w:ascii="Times New Roman" w:eastAsia="宋体" w:hAnsi="Times New Roman" w:cs="Times New Roman"/>
+        </w:rPr>
+        <w:t>按解决</w:t>
+      </w:r>
+      <w:proofErr w:type="gramEnd"/>
+      <w:r>
+        <w:rPr>
+          <w:rFonts w:ascii="Times New Roman" w:eastAsia="宋体" w:hAnsi="Times New Roman" w:cs="Times New Roman"/>
+        </w:rPr>
+        <w:t>的具体力学痛点展开，从基材微结构直接讲到宏观构件</w:t>
       </w:r>
       <w:r>
         <w:rPr>
@@ -720,7 +813,35 @@
         <w:rPr>
           <w:rFonts w:ascii="Times New Roman" w:eastAsia="宋体" w:hAnsi="Times New Roman" w:cs="Times New Roman" w:hint="eastAsia"/>
         </w:rPr>
-        <w:t>补充应用于跨海大桥桥墩防船撞套壳、极地海洋平台抗海冰冲击外壳。利用拉胀超材料的致密化机制吸收巨大的撞击动能。</w:t>
+        <w:t>补充应用于跨海大桥桥墩</w:t>
+      </w:r>
+      <w:proofErr w:type="gramStart"/>
+      <w:r>
+        <w:rPr>
+          <w:rFonts w:ascii="Times New Roman" w:eastAsia="宋体" w:hAnsi="Times New Roman" w:cs="Times New Roman" w:hint="eastAsia"/>
+        </w:rPr>
+        <w:t>防船撞套</w:t>
+      </w:r>
+      <w:proofErr w:type="gramEnd"/>
+      <w:r>
+        <w:rPr>
+          <w:rFonts w:ascii="Times New Roman" w:eastAsia="宋体" w:hAnsi="Times New Roman" w:cs="Times New Roman" w:hint="eastAsia"/>
+        </w:rPr>
+        <w:t>壳、极地海洋平台抗海冰冲击外壳。利用拉胀</w:t>
+      </w:r>
+      <w:proofErr w:type="gramStart"/>
+      <w:r>
+        <w:rPr>
+          <w:rFonts w:ascii="Times New Roman" w:eastAsia="宋体" w:hAnsi="Times New Roman" w:cs="Times New Roman" w:hint="eastAsia"/>
+        </w:rPr>
+        <w:t>超材料</w:t>
+      </w:r>
+      <w:proofErr w:type="gramEnd"/>
+      <w:r>
+        <w:rPr>
+          <w:rFonts w:ascii="Times New Roman" w:eastAsia="宋体" w:hAnsi="Times New Roman" w:cs="Times New Roman" w:hint="eastAsia"/>
+        </w:rPr>
+        <w:t>的致密化机制吸收巨大的撞击动能。</w:t>
       </w:r>
     </w:p>
     <w:p>
@@ -954,11 +1075,19 @@
         </w:rPr>
         <w:t>智能载体。</w:t>
       </w:r>
-      <w:r>
-        <w:rPr>
-          <w:rFonts w:ascii="Times New Roman" w:eastAsia="宋体" w:hAnsi="Times New Roman" w:cs="Times New Roman" w:hint="eastAsia"/>
-        </w:rPr>
-        <w:t>超材料不仅改变力学性能，更赋予结构波能屏蔽（地震波</w:t>
+      <w:proofErr w:type="gramStart"/>
+      <w:r>
+        <w:rPr>
+          <w:rFonts w:ascii="Times New Roman" w:eastAsia="宋体" w:hAnsi="Times New Roman" w:cs="Times New Roman" w:hint="eastAsia"/>
+        </w:rPr>
+        <w:t>超材料</w:t>
+      </w:r>
+      <w:proofErr w:type="gramEnd"/>
+      <w:r>
+        <w:rPr>
+          <w:rFonts w:ascii="Times New Roman" w:eastAsia="宋体" w:hAnsi="Times New Roman" w:cs="Times New Roman" w:hint="eastAsia"/>
+        </w:rPr>
+        <w:t>不仅改变力学性能，更赋予结构波能屏蔽（地震波</w:t>
       </w:r>
       <w:r>
         <w:rPr>
@@ -1180,8 +1309,17 @@
           <w:rFonts w:ascii="Times New Roman" w:eastAsia="宋体" w:hAnsi="Times New Roman" w:cs="Times New Roman"/>
           <w:b/>
         </w:rPr>
-        <w:t>热物理场：无源调控与零碳建筑</w:t>
-      </w:r>
+        <w:t>热物理场：无源调控</w:t>
+      </w:r>
+      <w:proofErr w:type="gramStart"/>
+      <w:r>
+        <w:rPr>
+          <w:rFonts w:ascii="Times New Roman" w:eastAsia="宋体" w:hAnsi="Times New Roman" w:cs="Times New Roman"/>
+          <w:b/>
+        </w:rPr>
+        <w:t>与零碳建筑</w:t>
+      </w:r>
+      <w:proofErr w:type="gramEnd"/>
     </w:p>
     <w:p>
       <w:pPr>
@@ -1340,7 +1478,23 @@
           <w:rFonts w:ascii="Times New Roman" w:eastAsia="宋体" w:hAnsi="Times New Roman" w:cs="Times New Roman" w:hint="eastAsia"/>
           <w:b/>
         </w:rPr>
-        <w:t>水动力场：海浪“隐身”与流固耦合调控</w:t>
+        <w:t>水动力场：海浪“隐身”</w:t>
+      </w:r>
+      <w:proofErr w:type="gramStart"/>
+      <w:r>
+        <w:rPr>
+          <w:rFonts w:ascii="Times New Roman" w:eastAsia="宋体" w:hAnsi="Times New Roman" w:cs="Times New Roman" w:hint="eastAsia"/>
+          <w:b/>
+        </w:rPr>
+        <w:t>与流固耦合</w:t>
+      </w:r>
+      <w:proofErr w:type="gramEnd"/>
+      <w:r>
+        <w:rPr>
+          <w:rFonts w:ascii="Times New Roman" w:eastAsia="宋体" w:hAnsi="Times New Roman" w:cs="Times New Roman" w:hint="eastAsia"/>
+          <w:b/>
+        </w:rPr>
+        <w:t>调控</w:t>
       </w:r>
     </w:p>
     <w:p>
@@ -1356,11 +1510,19 @@
         </w:rPr>
         <w:t>微观设计：</w:t>
       </w:r>
-      <w:r>
-        <w:rPr>
-          <w:rFonts w:ascii="Times New Roman" w:eastAsia="宋体" w:hAnsi="Times New Roman" w:cs="Times New Roman" w:hint="eastAsia"/>
-        </w:rPr>
-        <w:t>水波超材料（</w:t>
+      <w:proofErr w:type="gramStart"/>
+      <w:r>
+        <w:rPr>
+          <w:rFonts w:ascii="Times New Roman" w:eastAsia="宋体" w:hAnsi="Times New Roman" w:cs="Times New Roman" w:hint="eastAsia"/>
+        </w:rPr>
+        <w:t>水波超</w:t>
+      </w:r>
+      <w:proofErr w:type="gramEnd"/>
+      <w:r>
+        <w:rPr>
+          <w:rFonts w:ascii="Times New Roman" w:eastAsia="宋体" w:hAnsi="Times New Roman" w:cs="Times New Roman" w:hint="eastAsia"/>
+        </w:rPr>
+        <w:t>材料（</w:t>
       </w:r>
       <w:r>
         <w:rPr>
@@ -1372,7 +1534,21 @@
         <w:rPr>
           <w:rFonts w:ascii="Times New Roman" w:eastAsia="宋体" w:hAnsi="Times New Roman" w:cs="Times New Roman"/>
         </w:rPr>
-        <w:t>）的各向异性导流柱阵列或亥姆霍兹共振腔结构。</w:t>
+        <w:t>）的各向异性导流柱阵列或亥</w:t>
+      </w:r>
+      <w:proofErr w:type="gramStart"/>
+      <w:r>
+        <w:rPr>
+          <w:rFonts w:ascii="Times New Roman" w:eastAsia="宋体" w:hAnsi="Times New Roman" w:cs="Times New Roman"/>
+        </w:rPr>
+        <w:t>姆霍兹</w:t>
+      </w:r>
+      <w:proofErr w:type="gramEnd"/>
+      <w:r>
+        <w:rPr>
+          <w:rFonts w:ascii="Times New Roman" w:eastAsia="宋体" w:hAnsi="Times New Roman" w:cs="Times New Roman"/>
+        </w:rPr>
+        <w:t>共振腔结构。</w:t>
       </w:r>
     </w:p>
     <w:p>
@@ -1464,7 +1640,21 @@
         <w:rPr>
           <w:rFonts w:ascii="Times New Roman" w:eastAsia="宋体" w:hAnsi="Times New Roman" w:cs="Times New Roman"/>
         </w:rPr>
-        <w:t>，超材料防波堤能高效吸收并耗散波浪能，甚至将波浪能转化为电能。</w:t>
+        <w:t>，</w:t>
+      </w:r>
+      <w:proofErr w:type="gramStart"/>
+      <w:r>
+        <w:rPr>
+          <w:rFonts w:ascii="Times New Roman" w:eastAsia="宋体" w:hAnsi="Times New Roman" w:cs="Times New Roman"/>
+        </w:rPr>
+        <w:t>超材料</w:t>
+      </w:r>
+      <w:proofErr w:type="gramEnd"/>
+      <w:r>
+        <w:rPr>
+          <w:rFonts w:ascii="Times New Roman" w:eastAsia="宋体" w:hAnsi="Times New Roman" w:cs="Times New Roman"/>
+        </w:rPr>
+        <w:t>防波堤能高效吸收并耗散波浪能，甚至将波浪能转化为电能。</w:t>
       </w:r>
     </w:p>
     <w:p>
@@ -1532,11 +1722,26 @@
           <w:rFonts w:ascii="Times New Roman" w:eastAsia="宋体" w:hAnsi="Times New Roman" w:cs="Times New Roman"/>
         </w:rPr>
       </w:pPr>
-      <w:r>
-        <w:rPr>
-          <w:rFonts w:ascii="Times New Roman" w:eastAsia="宋体" w:hAnsi="Times New Roman" w:cs="Times New Roman"/>
-        </w:rPr>
-        <w:t>面对全球大量老化的基础设施，超材料为无损或微创加固提供了全新维度。</w:t>
+      <w:bookmarkStart w:id="0" w:name="OLE_LINK1"/>
+      <w:r>
+        <w:rPr>
+          <w:rFonts w:ascii="Times New Roman" w:eastAsia="宋体" w:hAnsi="Times New Roman" w:cs="Times New Roman"/>
+        </w:rPr>
+        <w:t>面对全球大量老化的基础设施，</w:t>
+      </w:r>
+      <w:proofErr w:type="gramStart"/>
+      <w:r>
+        <w:rPr>
+          <w:rFonts w:ascii="Times New Roman" w:eastAsia="宋体" w:hAnsi="Times New Roman" w:cs="Times New Roman"/>
+        </w:rPr>
+        <w:t>超材料</w:t>
+      </w:r>
+      <w:proofErr w:type="gramEnd"/>
+      <w:r>
+        <w:rPr>
+          <w:rFonts w:ascii="Times New Roman" w:eastAsia="宋体" w:hAnsi="Times New Roman" w:cs="Times New Roman"/>
+        </w:rPr>
+        <w:t>为无损或微创加固提供了全新维度。</w:t>
       </w:r>
       <w:r>
         <w:rPr>
@@ -1544,6 +1749,7 @@
         </w:rPr>
         <w:t>聚焦工程实用性，强调精准干预，即在维持原结构主干体系不变的前提下，实现薄弱环节靶向升级与性能优化的潜力。</w:t>
       </w:r>
+      <w:bookmarkEnd w:id="0"/>
       <w:r>
         <w:rPr>
           <w:rFonts w:ascii="Times New Roman" w:eastAsia="宋体" w:hAnsi="Times New Roman" w:cs="Times New Roman"/>
@@ -1633,7 +1839,21 @@
         <w:rPr>
           <w:rFonts w:ascii="Times New Roman" w:eastAsia="宋体" w:hAnsi="Times New Roman" w:cs="Times New Roman"/>
         </w:rPr>
-        <w:t>人致振动（如大跨人行桥），贴附极轻的局域共振超材料，</w:t>
+        <w:t>人致振动（如大跨人行桥），贴附极轻的局域</w:t>
+      </w:r>
+      <w:proofErr w:type="gramStart"/>
+      <w:r>
+        <w:rPr>
+          <w:rFonts w:ascii="Times New Roman" w:eastAsia="宋体" w:hAnsi="Times New Roman" w:cs="Times New Roman"/>
+        </w:rPr>
+        <w:t>共振超</w:t>
+      </w:r>
+      <w:proofErr w:type="gramEnd"/>
+      <w:r>
+        <w:rPr>
+          <w:rFonts w:ascii="Times New Roman" w:eastAsia="宋体" w:hAnsi="Times New Roman" w:cs="Times New Roman"/>
+        </w:rPr>
+        <w:t>材料，</w:t>
       </w:r>
       <w:r>
         <w:rPr>
@@ -1663,7 +1883,21 @@
         <w:rPr>
           <w:rFonts w:ascii="Times New Roman" w:eastAsia="宋体" w:hAnsi="Times New Roman" w:cs="Times New Roman"/>
         </w:rPr>
-        <w:t>）或海上风电塔筒的涡激振动（</w:t>
+        <w:t>）或海上风电塔筒的</w:t>
+      </w:r>
+      <w:proofErr w:type="gramStart"/>
+      <w:r>
+        <w:rPr>
+          <w:rFonts w:ascii="Times New Roman" w:eastAsia="宋体" w:hAnsi="Times New Roman" w:cs="Times New Roman"/>
+        </w:rPr>
+        <w:t>涡</w:t>
+      </w:r>
+      <w:proofErr w:type="gramEnd"/>
+      <w:r>
+        <w:rPr>
+          <w:rFonts w:ascii="Times New Roman" w:eastAsia="宋体" w:hAnsi="Times New Roman" w:cs="Times New Roman"/>
+        </w:rPr>
+        <w:t>激振动（</w:t>
       </w:r>
       <w:r>
         <w:rPr>
@@ -1701,7 +1935,21 @@
         <w:rPr>
           <w:rFonts w:ascii="Times New Roman" w:eastAsia="宋体" w:hAnsi="Times New Roman" w:cs="Times New Roman"/>
         </w:rPr>
-        <w:t>针对洋流引起的特定频率流致振动，贴附局域共振贴片，避免结构疲劳断裂。</w:t>
+        <w:t>针对洋流引起的特定</w:t>
+      </w:r>
+      <w:proofErr w:type="gramStart"/>
+      <w:r>
+        <w:rPr>
+          <w:rFonts w:ascii="Times New Roman" w:eastAsia="宋体" w:hAnsi="Times New Roman" w:cs="Times New Roman"/>
+        </w:rPr>
+        <w:t>频率流致振动</w:t>
+      </w:r>
+      <w:proofErr w:type="gramEnd"/>
+      <w:r>
+        <w:rPr>
+          <w:rFonts w:ascii="Times New Roman" w:eastAsia="宋体" w:hAnsi="Times New Roman" w:cs="Times New Roman"/>
+        </w:rPr>
+        <w:t>，贴附局域共振贴片，避免结构疲劳断裂。</w:t>
       </w:r>
     </w:p>
     <w:p>
@@ -1756,7 +2004,21 @@
         <w:rPr>
           <w:rFonts w:ascii="Times New Roman" w:eastAsia="宋体" w:hAnsi="Times New Roman" w:cs="Times New Roman"/>
         </w:rPr>
-        <w:t>用拉胀超材料或形状记忆合金（</w:t>
+        <w:t>用拉胀</w:t>
+      </w:r>
+      <w:proofErr w:type="gramStart"/>
+      <w:r>
+        <w:rPr>
+          <w:rFonts w:ascii="Times New Roman" w:eastAsia="宋体" w:hAnsi="Times New Roman" w:cs="Times New Roman"/>
+        </w:rPr>
+        <w:t>超材料</w:t>
+      </w:r>
+      <w:proofErr w:type="gramEnd"/>
+      <w:r>
+        <w:rPr>
+          <w:rFonts w:ascii="Times New Roman" w:eastAsia="宋体" w:hAnsi="Times New Roman" w:cs="Times New Roman"/>
+        </w:rPr>
+        <w:t>或形状记忆合金（</w:t>
       </w:r>
       <w:r>
         <w:rPr>
@@ -1897,7 +2159,21 @@
         <w:rPr>
           <w:rFonts w:ascii="Times New Roman" w:eastAsia="宋体" w:hAnsi="Times New Roman" w:cs="Times New Roman"/>
         </w:rPr>
-        <w:t>）或可变节点超材料进行加固。</w:t>
+        <w:t>）或可变</w:t>
+      </w:r>
+      <w:proofErr w:type="gramStart"/>
+      <w:r>
+        <w:rPr>
+          <w:rFonts w:ascii="Times New Roman" w:eastAsia="宋体" w:hAnsi="Times New Roman" w:cs="Times New Roman"/>
+        </w:rPr>
+        <w:t>节点超材料</w:t>
+      </w:r>
+      <w:proofErr w:type="gramEnd"/>
+      <w:r>
+        <w:rPr>
+          <w:rFonts w:ascii="Times New Roman" w:eastAsia="宋体" w:hAnsi="Times New Roman" w:cs="Times New Roman"/>
+        </w:rPr>
+        <w:t>进行加固。</w:t>
       </w:r>
     </w:p>
     <w:p>
@@ -1918,7 +2194,35 @@
         <w:rPr>
           <w:rFonts w:ascii="Times New Roman" w:eastAsia="宋体" w:hAnsi="Times New Roman" w:cs="Times New Roman" w:hint="eastAsia"/>
         </w:rPr>
-        <w:t>：当建筑改变用途或荷载增加时，工程人员只需调整超材料节点的几何约束，即可重塑加固体系的传力路径，大大延长结构寿命。</w:t>
+        <w:t>：当建筑改变用途或荷载增加时，工程人员只需调整</w:t>
+      </w:r>
+      <w:proofErr w:type="gramStart"/>
+      <w:r>
+        <w:rPr>
+          <w:rFonts w:ascii="Times New Roman" w:eastAsia="宋体" w:hAnsi="Times New Roman" w:cs="Times New Roman" w:hint="eastAsia"/>
+        </w:rPr>
+        <w:t>超材料</w:t>
+      </w:r>
+      <w:proofErr w:type="gramEnd"/>
+      <w:r>
+        <w:rPr>
+          <w:rFonts w:ascii="Times New Roman" w:eastAsia="宋体" w:hAnsi="Times New Roman" w:cs="Times New Roman" w:hint="eastAsia"/>
+        </w:rPr>
+        <w:t>节点的几何约束，即可重塑加固体系</w:t>
+      </w:r>
+      <w:proofErr w:type="gramStart"/>
+      <w:r>
+        <w:rPr>
+          <w:rFonts w:ascii="Times New Roman" w:eastAsia="宋体" w:hAnsi="Times New Roman" w:cs="Times New Roman" w:hint="eastAsia"/>
+        </w:rPr>
+        <w:t>的传力路径</w:t>
+      </w:r>
+      <w:proofErr w:type="gramEnd"/>
+      <w:r>
+        <w:rPr>
+          <w:rFonts w:ascii="Times New Roman" w:eastAsia="宋体" w:hAnsi="Times New Roman" w:cs="Times New Roman" w:hint="eastAsia"/>
+        </w:rPr>
+        <w:t>，大大延长结构寿命。</w:t>
       </w:r>
     </w:p>
     <w:p>
@@ -1971,11 +2275,19 @@
           <w:rFonts w:ascii="Times New Roman" w:eastAsia="宋体" w:hAnsi="Times New Roman" w:cs="Times New Roman"/>
         </w:rPr>
       </w:pPr>
-      <w:r>
-        <w:rPr>
-          <w:rFonts w:ascii="Times New Roman" w:eastAsia="宋体" w:hAnsi="Times New Roman" w:cs="Times New Roman"/>
-        </w:rPr>
-        <w:t>超材料在土木工程中有性能提升、功能拓展和加固优化三重价值。</w:t>
+      <w:proofErr w:type="gramStart"/>
+      <w:r>
+        <w:rPr>
+          <w:rFonts w:ascii="Times New Roman" w:eastAsia="宋体" w:hAnsi="Times New Roman" w:cs="Times New Roman"/>
+        </w:rPr>
+        <w:t>超材料</w:t>
+      </w:r>
+      <w:proofErr w:type="gramEnd"/>
+      <w:r>
+        <w:rPr>
+          <w:rFonts w:ascii="Times New Roman" w:eastAsia="宋体" w:hAnsi="Times New Roman" w:cs="Times New Roman"/>
+        </w:rPr>
+        <w:t>在土木工程中有性能提升、功能拓展和加固优化三重价值。</w:t>
       </w:r>
       <w:r>
         <w:rPr>
@@ -2154,7 +2466,21 @@
         <w:rPr>
           <w:rFonts w:ascii="Times New Roman" w:eastAsia="宋体" w:hAnsi="Times New Roman" w:cs="Times New Roman" w:hint="eastAsia"/>
         </w:rPr>
-        <w:t>微纳米实验室制备技术难以匹配土木体量，且面临经济性考量。</w:t>
+        <w:t>微纳米实验室制备技术难以匹配土木体量，且面临经济性</w:t>
+      </w:r>
+      <w:proofErr w:type="gramStart"/>
+      <w:r>
+        <w:rPr>
+          <w:rFonts w:ascii="Times New Roman" w:eastAsia="宋体" w:hAnsi="Times New Roman" w:cs="Times New Roman" w:hint="eastAsia"/>
+        </w:rPr>
+        <w:t>考量</w:t>
+      </w:r>
+      <w:proofErr w:type="gramEnd"/>
+      <w:r>
+        <w:rPr>
+          <w:rFonts w:ascii="Times New Roman" w:eastAsia="宋体" w:hAnsi="Times New Roman" w:cs="Times New Roman" w:hint="eastAsia"/>
+        </w:rPr>
+        <w:t>。</w:t>
       </w:r>
     </w:p>
     <w:p>
@@ -2198,7 +2524,21 @@
         <w:rPr>
           <w:rFonts w:ascii="Times New Roman" w:eastAsia="宋体" w:hAnsi="Times New Roman" w:cs="Times New Roman"/>
         </w:rPr>
-        <w:t>）与电弧增材制造（</w:t>
+        <w:t>）与</w:t>
+      </w:r>
+      <w:proofErr w:type="gramStart"/>
+      <w:r>
+        <w:rPr>
+          <w:rFonts w:ascii="Times New Roman" w:eastAsia="宋体" w:hAnsi="Times New Roman" w:cs="Times New Roman"/>
+        </w:rPr>
+        <w:t>电弧增材制造</w:t>
+      </w:r>
+      <w:proofErr w:type="gramEnd"/>
+      <w:r>
+        <w:rPr>
+          <w:rFonts w:ascii="Times New Roman" w:eastAsia="宋体" w:hAnsi="Times New Roman" w:cs="Times New Roman"/>
+        </w:rPr>
+        <w:t>（</w:t>
       </w:r>
       <w:r>
         <w:rPr>
@@ -2255,11 +2595,19 @@
         </w:rPr>
         <w:t>痛点：</w:t>
       </w:r>
-      <w:r>
-        <w:rPr>
-          <w:rFonts w:ascii="Times New Roman" w:eastAsia="宋体" w:hAnsi="Times New Roman" w:cs="Times New Roman" w:hint="eastAsia"/>
-        </w:rPr>
-        <w:t>超材料孔隙多、易应力集中，在氯离子、碳化、冻融等复杂环境下的长期疲劳寿命与退化规律尚是盲区。</w:t>
+      <w:proofErr w:type="gramStart"/>
+      <w:r>
+        <w:rPr>
+          <w:rFonts w:ascii="Times New Roman" w:eastAsia="宋体" w:hAnsi="Times New Roman" w:cs="Times New Roman" w:hint="eastAsia"/>
+        </w:rPr>
+        <w:t>超材料</w:t>
+      </w:r>
+      <w:proofErr w:type="gramEnd"/>
+      <w:r>
+        <w:rPr>
+          <w:rFonts w:ascii="Times New Roman" w:eastAsia="宋体" w:hAnsi="Times New Roman" w:cs="Times New Roman" w:hint="eastAsia"/>
+        </w:rPr>
+        <w:t>孔隙多、易应力集中，在氯离子、碳化、冻融等复杂环境下的长期疲劳寿命与退化规律尚是盲区。</w:t>
       </w:r>
       <w:r>
         <w:rPr>
@@ -2277,7 +2625,35 @@
         <w:rPr>
           <w:rFonts w:ascii="Times New Roman" w:eastAsia="宋体" w:hAnsi="Times New Roman" w:cs="Times New Roman"/>
         </w:rPr>
-        <w:t>）对超材料微观孔隙的堵塞问题，这些都是目前超材料从陆地走向海洋急需攻克的盲区。</w:t>
+        <w:t>）对</w:t>
+      </w:r>
+      <w:proofErr w:type="gramStart"/>
+      <w:r>
+        <w:rPr>
+          <w:rFonts w:ascii="Times New Roman" w:eastAsia="宋体" w:hAnsi="Times New Roman" w:cs="Times New Roman"/>
+        </w:rPr>
+        <w:t>超材料</w:t>
+      </w:r>
+      <w:proofErr w:type="gramEnd"/>
+      <w:r>
+        <w:rPr>
+          <w:rFonts w:ascii="Times New Roman" w:eastAsia="宋体" w:hAnsi="Times New Roman" w:cs="Times New Roman"/>
+        </w:rPr>
+        <w:t>微观孔隙的堵塞问题，这些都是目前</w:t>
+      </w:r>
+      <w:proofErr w:type="gramStart"/>
+      <w:r>
+        <w:rPr>
+          <w:rFonts w:ascii="Times New Roman" w:eastAsia="宋体" w:hAnsi="Times New Roman" w:cs="Times New Roman"/>
+        </w:rPr>
+        <w:t>超材料</w:t>
+      </w:r>
+      <w:proofErr w:type="gramEnd"/>
+      <w:r>
+        <w:rPr>
+          <w:rFonts w:ascii="Times New Roman" w:eastAsia="宋体" w:hAnsi="Times New Roman" w:cs="Times New Roman"/>
+        </w:rPr>
+        <w:t>从陆地走向海洋急需攻克的盲区。</w:t>
       </w:r>
     </w:p>
     <w:p>
@@ -2297,7 +2673,21 @@
         <w:rPr>
           <w:rFonts w:ascii="Times New Roman" w:eastAsia="宋体" w:hAnsi="Times New Roman" w:cs="Times New Roman" w:hint="eastAsia"/>
         </w:rPr>
-        <w:t>亟待建立超材料等效宏观力学的工程设计标准与规范体系。</w:t>
+        <w:t>亟待建立</w:t>
+      </w:r>
+      <w:proofErr w:type="gramStart"/>
+      <w:r>
+        <w:rPr>
+          <w:rFonts w:ascii="Times New Roman" w:eastAsia="宋体" w:hAnsi="Times New Roman" w:cs="Times New Roman" w:hint="eastAsia"/>
+        </w:rPr>
+        <w:t>超材料</w:t>
+      </w:r>
+      <w:proofErr w:type="gramEnd"/>
+      <w:r>
+        <w:rPr>
+          <w:rFonts w:ascii="Times New Roman" w:eastAsia="宋体" w:hAnsi="Times New Roman" w:cs="Times New Roman" w:hint="eastAsia"/>
+        </w:rPr>
+        <w:t>等效宏观力学的工程设计标准与规范体系。</w:t>
       </w:r>
     </w:p>
     <w:p>
@@ -2351,11 +2741,19 @@
           <w:rFonts w:ascii="Times New Roman" w:eastAsia="宋体" w:hAnsi="Times New Roman" w:cs="Times New Roman"/>
         </w:rPr>
       </w:pPr>
-      <w:r>
-        <w:rPr>
-          <w:rFonts w:ascii="Times New Roman" w:eastAsia="宋体" w:hAnsi="Times New Roman" w:cs="Times New Roman" w:hint="eastAsia"/>
-        </w:rPr>
-        <w:t>超材料赋能的建筑将从“被动承载”转向“主动响应”。</w:t>
+      <w:proofErr w:type="gramStart"/>
+      <w:r>
+        <w:rPr>
+          <w:rFonts w:ascii="Times New Roman" w:eastAsia="宋体" w:hAnsi="Times New Roman" w:cs="Times New Roman" w:hint="eastAsia"/>
+        </w:rPr>
+        <w:t>超材料</w:t>
+      </w:r>
+      <w:proofErr w:type="gramEnd"/>
+      <w:r>
+        <w:rPr>
+          <w:rFonts w:ascii="Times New Roman" w:eastAsia="宋体" w:hAnsi="Times New Roman" w:cs="Times New Roman" w:hint="eastAsia"/>
+        </w:rPr>
+        <w:t>赋能的建筑将从“被动承载”转向“主动响应”。</w:t>
       </w:r>
     </w:p>
     <w:p>
@@ -2381,7 +2779,21 @@
         <w:rPr>
           <w:rFonts w:ascii="Times New Roman" w:eastAsia="宋体" w:hAnsi="Times New Roman" w:cs="Times New Roman"/>
         </w:rPr>
-        <w:t>技术、数字孪生与智能建造，最终实现</w:t>
+        <w:t>技术、数字</w:t>
+      </w:r>
+      <w:proofErr w:type="gramStart"/>
+      <w:r>
+        <w:rPr>
+          <w:rFonts w:ascii="Times New Roman" w:eastAsia="宋体" w:hAnsi="Times New Roman" w:cs="Times New Roman"/>
+        </w:rPr>
+        <w:t>孪生与</w:t>
+      </w:r>
+      <w:proofErr w:type="gramEnd"/>
+      <w:r>
+        <w:rPr>
+          <w:rFonts w:ascii="Times New Roman" w:eastAsia="宋体" w:hAnsi="Times New Roman" w:cs="Times New Roman"/>
+        </w:rPr>
+        <w:t>智能建造，最终实现</w:t>
       </w:r>
       <w:r>
         <w:rPr>
@@ -2460,12 +2872,10 @@
     <w:p>
       <w:pPr>
         <w:rPr>
-          <w:rFonts w:ascii="Times New Roman" w:eastAsia="宋体" w:hAnsi="Times New Roman" w:cs="Times New Roman" w:hint="eastAsia"/>
-          <w:b/>
-        </w:rPr>
-      </w:pPr>
-      <w:bookmarkStart w:id="0" w:name="_GoBack"/>
-      <w:bookmarkEnd w:id="0"/>
+          <w:rFonts w:ascii="Times New Roman" w:eastAsia="宋体" w:hAnsi="Times New Roman" w:cs="Times New Roman"/>
+          <w:b/>
+        </w:rPr>
+      </w:pPr>
     </w:p>
     <w:sectPr>
       <w:pgSz w:w="11906" w:h="16838"/>
@@ -2478,9 +2888,14 @@
 </file>
 
 <file path=word/endnotes.xml><?xml version="1.0" encoding="utf-8"?>
-<w:endnotes xmlns:wpc="http://schemas.microsoft.com/office/word/2010/wordprocessingCanvas" xmlns:cx="http://schemas.microsoft.com/office/drawing/2014/chartex" xmlns:cx1="http://schemas.microsoft.com/office/drawing/2015/9/8/chartex" xmlns:mc="http://schemas.openxmlformats.org/markup-compatibility/2006" xmlns:o="urn:schemas-microsoft-com:office:office" xmlns:r="http://schemas.openxmlformats.org/officeDocument/2006/relationships" xmlns:m="http://schemas.openxmlformats.org/officeDocument/2006/math" xmlns:v="urn:schemas-microsoft-com:vml" xmlns:wp14="http://schemas.microsoft.com/office/word/2010/wordprocessingDrawing" xmlns:wp="http://schemas.openxmlformats.org/drawingml/2006/wordprocessingDrawing" xmlns:w10="urn:schemas-microsoft-com:office:word" xmlns:w="http://schemas.openxmlformats.org/wordprocessingml/2006/main" xmlns:w14="http://schemas.microsoft.com/office/word/2010/wordml" xmlns:w15="http://schemas.microsoft.com/office/word/2012/wordml" xmlns:w16se="http://schemas.microsoft.com/office/word/2015/wordml/symex" xmlns:wpg="http://schemas.microsoft.com/office/word/2010/wordprocessingGroup" xmlns:wpi="http://schemas.microsoft.com/office/word/2010/wordprocessingInk" xmlns:wne="http://schemas.microsoft.com/office/word/2006/wordml" xmlns:wps="http://schemas.microsoft.com/office/word/2010/wordprocessingShape" mc:Ignorable="w14 w15 w16se wp14">
+<w:endnotes xmlns:wpc="http://schemas.microsoft.com/office/word/2010/wordprocessingCanvas" xmlns:cx="http://schemas.microsoft.com/office/drawing/2014/chartex" xmlns:cx1="http://schemas.microsoft.com/office/drawing/2015/9/8/chartex" xmlns:cx2="http://schemas.microsoft.com/office/drawing/2015/10/21/chartex" xmlns:cx3="http://schemas.microsoft.com/office/drawing/2016/5/9/chartex" xmlns:cx4="http://schemas.microsoft.com/office/drawing/2016/5/10/chartex" xmlns:cx5="http://schemas.microsoft.com/office/drawing/2016/5/11/chartex" xmlns:cx6="http://schemas.microsoft.com/office/drawing/2016/5/12/chartex" xmlns:cx7="http://schemas.microsoft.com/office/drawing/2016/5/13/chartex" xmlns:cx8="http://schemas.microsoft.com/office/drawing/2016/5/14/chartex" xmlns:mc="http://schemas.openxmlformats.org/markup-compatibility/2006" xmlns:aink="http://schemas.microsoft.com/office/drawing/2016/ink" xmlns:am3d="http://schemas.microsoft.com/office/drawing/2017/model3d" xmlns:o="urn:schemas-microsoft-com:office:office" xmlns:oel="http://schemas.microsoft.com/office/2019/extlst" xmlns:r="http://schemas.openxmlformats.org/officeDocument/2006/relationships" xmlns:m="http://schemas.openxmlformats.org/officeDocument/2006/math" xmlns:v="urn:schemas-microsoft-com:vml" xmlns:wp14="http://schemas.microsoft.com/office/word/2010/wordprocessingDrawing" xmlns:wp="http://schemas.openxmlformats.org/drawingml/2006/wordprocessingDrawing" xmlns:w10="urn:schemas-microsoft-com:office:word" xmlns:w="http://schemas.openxmlformats.org/wordprocessingml/2006/main" xmlns:w14="http://schemas.microsoft.com/office/word/2010/wordml" xmlns:w15="http://schemas.microsoft.com/office/word/2012/wordml" xmlns:w16cex="http://schemas.microsoft.com/office/word/2018/wordml/cex" xmlns:w16cid="http://schemas.microsoft.com/office/word/2016/wordml/cid" xmlns:w16="http://schemas.microsoft.com/office/word/2018/wordml" xmlns:w16du="http://schemas.microsoft.com/office/word/2023/wordml/word16du" xmlns:w16sdtdh="http://schemas.microsoft.com/office/word/2020/wordml/sdtdatahash" xmlns:w16sdtfl="http://schemas.microsoft.com/office/word/2024/wordml/sdtformatlock" xmlns:w16se="http://schemas.microsoft.com/office/word/2015/wordml/symex" xmlns:wpg="http://schemas.microsoft.com/office/word/2010/wordprocessingGroup" xmlns:wpi="http://schemas.microsoft.com/office/word/2010/wordprocessingInk" xmlns:wne="http://schemas.microsoft.com/office/word/2006/wordml" xmlns:wps="http://schemas.microsoft.com/office/word/2010/wordprocessingShape" mc:Ignorable="w14 w15 w16se w16cid w16 w16cex w16sdtdh w16sdtfl w16du wp14">
   <w:endnote w:type="separator" w:id="-1">
     <w:p>
+      <w:pPr>
+        <w:rPr>
+          <w:rFonts w:hint="eastAsia"/>
+        </w:rPr>
+      </w:pPr>
       <w:r>
         <w:separator/>
       </w:r>
@@ -2488,6 +2903,11 @@
   </w:endnote>
   <w:endnote w:type="continuationSeparator" w:id="0">
     <w:p>
+      <w:pPr>
+        <w:rPr>
+          <w:rFonts w:hint="eastAsia"/>
+        </w:rPr>
+      </w:pPr>
       <w:r>
         <w:continuationSeparator/>
       </w:r>
@@ -2497,9 +2917,14 @@
 </file>
 
 <file path=word/footnotes.xml><?xml version="1.0" encoding="utf-8"?>
-<w:footnotes xmlns:wpc="http://schemas.microsoft.com/office/word/2010/wordprocessingCanvas" xmlns:cx="http://schemas.microsoft.com/office/drawing/2014/chartex" xmlns:cx1="http://schemas.microsoft.com/office/drawing/2015/9/8/chartex" xmlns:mc="http://schemas.openxmlformats.org/markup-compatibility/2006" xmlns:o="urn:schemas-microsoft-com:office:office" xmlns:r="http://schemas.openxmlformats.org/officeDocument/2006/relationships" xmlns:m="http://schemas.openxmlformats.org/officeDocument/2006/math" xmlns:v="urn:schemas-microsoft-com:vml" xmlns:wp14="http://schemas.microsoft.com/office/word/2010/wordprocessingDrawing" xmlns:wp="http://schemas.openxmlformats.org/drawingml/2006/wordprocessingDrawing" xmlns:w10="urn:schemas-microsoft-com:office:word" xmlns:w="http://schemas.openxmlformats.org/wordprocessingml/2006/main" xmlns:w14="http://schemas.microsoft.com/office/word/2010/wordml" xmlns:w15="http://schemas.microsoft.com/office/word/2012/wordml" xmlns:w16se="http://schemas.microsoft.com/office/word/2015/wordml/symex" xmlns:wpg="http://schemas.microsoft.com/office/word/2010/wordprocessingGroup" xmlns:wpi="http://schemas.microsoft.com/office/word/2010/wordprocessingInk" xmlns:wne="http://schemas.microsoft.com/office/word/2006/wordml" xmlns:wps="http://schemas.microsoft.com/office/word/2010/wordprocessingShape" mc:Ignorable="w14 w15 w16se wp14">
+<w:footnotes xmlns:wpc="http://schemas.microsoft.com/office/word/2010/wordprocessingCanvas" xmlns:cx="http://schemas.microsoft.com/office/drawing/2014/chartex" xmlns:cx1="http://schemas.microsoft.com/office/drawing/2015/9/8/chartex" xmlns:cx2="http://schemas.microsoft.com/office/drawing/2015/10/21/chartex" xmlns:cx3="http://schemas.microsoft.com/office/drawing/2016/5/9/chartex" xmlns:cx4="http://schemas.microsoft.com/office/drawing/2016/5/10/chartex" xmlns:cx5="http://schemas.microsoft.com/office/drawing/2016/5/11/chartex" xmlns:cx6="http://schemas.microsoft.com/office/drawing/2016/5/12/chartex" xmlns:cx7="http://schemas.microsoft.com/office/drawing/2016/5/13/chartex" xmlns:cx8="http://schemas.microsoft.com/office/drawing/2016/5/14/chartex" xmlns:mc="http://schemas.openxmlformats.org/markup-compatibility/2006" xmlns:aink="http://schemas.microsoft.com/office/drawing/2016/ink" xmlns:am3d="http://schemas.microsoft.com/office/drawing/2017/model3d" xmlns:o="urn:schemas-microsoft-com:office:office" xmlns:oel="http://schemas.microsoft.com/office/2019/extlst" xmlns:r="http://schemas.openxmlformats.org/officeDocument/2006/relationships" xmlns:m="http://schemas.openxmlformats.org/officeDocument/2006/math" xmlns:v="urn:schemas-microsoft-com:vml" xmlns:wp14="http://schemas.microsoft.com/office/word/2010/wordprocessingDrawing" xmlns:wp="http://schemas.openxmlformats.org/drawingml/2006/wordprocessingDrawing" xmlns:w10="urn:schemas-microsoft-com:office:word" xmlns:w="http://schemas.openxmlformats.org/wordprocessingml/2006/main" xmlns:w14="http://schemas.microsoft.com/office/word/2010/wordml" xmlns:w15="http://schemas.microsoft.com/office/word/2012/wordml" xmlns:w16cex="http://schemas.microsoft.com/office/word/2018/wordml/cex" xmlns:w16cid="http://schemas.microsoft.com/office/word/2016/wordml/cid" xmlns:w16="http://schemas.microsoft.com/office/word/2018/wordml" xmlns:w16du="http://schemas.microsoft.com/office/word/2023/wordml/word16du" xmlns:w16sdtdh="http://schemas.microsoft.com/office/word/2020/wordml/sdtdatahash" xmlns:w16sdtfl="http://schemas.microsoft.com/office/word/2024/wordml/sdtformatlock" xmlns:w16se="http://schemas.microsoft.com/office/word/2015/wordml/symex" xmlns:wpg="http://schemas.microsoft.com/office/word/2010/wordprocessingGroup" xmlns:wpi="http://schemas.microsoft.com/office/word/2010/wordprocessingInk" xmlns:wne="http://schemas.microsoft.com/office/word/2006/wordml" xmlns:wps="http://schemas.microsoft.com/office/word/2010/wordprocessingShape" mc:Ignorable="w14 w15 w16se w16cid w16 w16cex w16sdtdh w16sdtfl w16du wp14">
   <w:footnote w:type="separator" w:id="-1">
     <w:p>
+      <w:pPr>
+        <w:rPr>
+          <w:rFonts w:hint="eastAsia"/>
+        </w:rPr>
+      </w:pPr>
       <w:r>
         <w:separator/>
       </w:r>
@@ -2507,6 +2932,11 @@
   </w:footnote>
   <w:footnote w:type="continuationSeparator" w:id="0">
     <w:p>
+      <w:pPr>
+        <w:rPr>
+          <w:rFonts w:hint="eastAsia"/>
+        </w:rPr>
+      </w:pPr>
       <w:r>
         <w:continuationSeparator/>
       </w:r>
@@ -2516,7 +2946,7 @@
 </file>
 
 <file path=word/styles.xml><?xml version="1.0" encoding="utf-8"?>
-<w:styles xmlns:mc="http://schemas.openxmlformats.org/markup-compatibility/2006" xmlns:r="http://schemas.openxmlformats.org/officeDocument/2006/relationships" xmlns:w="http://schemas.openxmlformats.org/wordprocessingml/2006/main" xmlns:w14="http://schemas.microsoft.com/office/word/2010/wordml" xmlns:w15="http://schemas.microsoft.com/office/word/2012/wordml" xmlns:w16se="http://schemas.microsoft.com/office/word/2015/wordml/symex" mc:Ignorable="w14 w15 w16se">
+<w:styles xmlns:mc="http://schemas.openxmlformats.org/markup-compatibility/2006" xmlns:r="http://schemas.openxmlformats.org/officeDocument/2006/relationships" xmlns:w="http://schemas.openxmlformats.org/wordprocessingml/2006/main" xmlns:w14="http://schemas.microsoft.com/office/word/2010/wordml" xmlns:w15="http://schemas.microsoft.com/office/word/2012/wordml" xmlns:w16cex="http://schemas.microsoft.com/office/word/2018/wordml/cex" xmlns:w16cid="http://schemas.microsoft.com/office/word/2016/wordml/cid" xmlns:w16="http://schemas.microsoft.com/office/word/2018/wordml" xmlns:w16du="http://schemas.microsoft.com/office/word/2023/wordml/word16du" xmlns:w16sdtdh="http://schemas.microsoft.com/office/word/2020/wordml/sdtdatahash" xmlns:w16sdtfl="http://schemas.microsoft.com/office/word/2024/wordml/sdtformatlock" xmlns:w16se="http://schemas.microsoft.com/office/word/2015/wordml/symex" mc:Ignorable="w14 w15 w16se w16cid w16 w16cex w16sdtdh w16sdtfl w16du">
   <w:docDefaults>
     <w:rPrDefault>
       <w:rPr>
@@ -2529,7 +2959,7 @@
     </w:rPrDefault>
     <w:pPrDefault/>
   </w:docDefaults>
-  <w:latentStyles w:defLockedState="0" w:defUIPriority="99" w:defSemiHidden="0" w:defUnhideWhenUsed="0" w:defQFormat="0" w:count="371">
+  <w:latentStyles w:defLockedState="0" w:defUIPriority="99" w:defSemiHidden="0" w:defUnhideWhenUsed="0" w:defQFormat="0" w:count="376">
     <w:lsdException w:name="Normal" w:uiPriority="0" w:qFormat="1"/>
     <w:lsdException w:name="heading 1" w:uiPriority="9" w:qFormat="1"/>
     <w:lsdException w:name="heading 2" w:semiHidden="1" w:uiPriority="9" w:unhideWhenUsed="1" w:qFormat="1"/>
@@ -2901,6 +3331,11 @@
     <w:lsdException w:name="List Table 5 Dark Accent 6" w:uiPriority="50"/>
     <w:lsdException w:name="List Table 6 Colorful Accent 6" w:uiPriority="51"/>
     <w:lsdException w:name="List Table 7 Colorful Accent 6" w:uiPriority="52"/>
+    <w:lsdException w:name="Mention" w:semiHidden="1" w:unhideWhenUsed="1"/>
+    <w:lsdException w:name="Smart Hyperlink" w:semiHidden="1" w:unhideWhenUsed="1"/>
+    <w:lsdException w:name="Hashtag" w:semiHidden="1" w:unhideWhenUsed="1"/>
+    <w:lsdException w:name="Unresolved Mention" w:semiHidden="1" w:unhideWhenUsed="1"/>
+    <w:lsdException w:name="Smart Link" w:semiHidden="1" w:unhideWhenUsed="1"/>
   </w:latentStyles>
   <w:style w:type="paragraph" w:default="1" w:styleId="a">
     <w:name w:val="Normal"/>

</xml_diff>